<commit_message>
Initial commit: Medical Platform Report
</commit_message>
<xml_diff>
--- a/docs/Medical_Report_Executive_Analysis.docx
+++ b/docs/Medical_Report_Executive_Analysis.docx
@@ -143,19 +143,8 @@
                 <w:sz w:val="19"/>
                 <w:szCs w:val="19"/>
               </w:rPr>
-              <w:t xml:space="preserve">Nome e </w:t>
+              <w:t>Nome e Cognome</w:t>
             </w:r>
-            <w:proofErr w:type="spellStart"/>
-            <w:r>
-              <w:rPr>
-                <w:b/>
-                <w:bCs/>
-                <w:sz w:val="19"/>
-                <w:szCs w:val="19"/>
-              </w:rPr>
-              <w:t>Cognome</w:t>
-            </w:r>
-            <w:proofErr w:type="spellEnd"/>
           </w:p>
         </w:tc>
         <w:tc>
@@ -183,20 +172,8 @@
                 <w:sz w:val="19"/>
                 <w:szCs w:val="19"/>
               </w:rPr>
-              <w:t xml:space="preserve">Fabrizio </w:t>
+              <w:t>Fabrizio Fagetti</w:t>
             </w:r>
-            <w:proofErr w:type="spellStart"/>
-            <w:r>
-              <w:rPr>
-                <w:i/>
-                <w:iCs/>
-                <w:color w:val="auto"/>
-                <w:sz w:val="19"/>
-                <w:szCs w:val="19"/>
-              </w:rPr>
-              <w:t>Fagetti</w:t>
-            </w:r>
-            <w:proofErr w:type="spellEnd"/>
           </w:p>
         </w:tc>
       </w:tr>
@@ -217,7 +194,6 @@
             <w:vAlign w:val="center"/>
           </w:tcPr>
           <w:p>
-            <w:proofErr w:type="spellStart"/>
             <w:r>
               <w:rPr>
                 <w:b/>
@@ -227,7 +203,6 @@
               </w:rPr>
               <w:t>Ruolo</w:t>
             </w:r>
-            <w:proofErr w:type="spellEnd"/>
           </w:p>
         </w:tc>
         <w:tc>
@@ -417,48 +392,10 @@
             </w:pPr>
             <w:r>
               <w:rPr>
-                <w:i/>
-                <w:iCs/>
                 <w:color w:val="auto"/>
-                <w:sz w:val="19"/>
-                <w:szCs w:val="19"/>
-              </w:rPr>
-              <w:t>github.com/</w:t>
+              </w:rPr>
+              <w:t>github.com/Fabriscious/Medical-Platform-Report</w:t>
             </w:r>
-            <w:proofErr w:type="spellStart"/>
-            <w:r>
-              <w:rPr>
-                <w:i/>
-                <w:iCs/>
-                <w:color w:val="auto"/>
-                <w:sz w:val="19"/>
-                <w:szCs w:val="19"/>
-              </w:rPr>
-              <w:t>Fabriscious</w:t>
-            </w:r>
-            <w:proofErr w:type="spellEnd"/>
-            <w:r>
-              <w:rPr>
-                <w:i/>
-                <w:iCs/>
-                <w:color w:val="auto"/>
-                <w:sz w:val="19"/>
-                <w:szCs w:val="19"/>
-              </w:rPr>
-              <w:t>/energy-transition-</w:t>
-            </w:r>
-            <w:proofErr w:type="spellStart"/>
-            <w:r>
-              <w:rPr>
-                <w:i/>
-                <w:iCs/>
-                <w:color w:val="auto"/>
-                <w:sz w:val="19"/>
-                <w:szCs w:val="19"/>
-              </w:rPr>
-              <w:t>italy</w:t>
-            </w:r>
-            <w:proofErr w:type="spellEnd"/>
           </w:p>
         </w:tc>
       </w:tr>
@@ -494,19 +431,8 @@
                 <w:sz w:val="19"/>
                 <w:szCs w:val="19"/>
               </w:rPr>
-              <w:t xml:space="preserve">Video </w:t>
+              <w:t>Video Introduttivo</w:t>
             </w:r>
-            <w:proofErr w:type="spellStart"/>
-            <w:r>
-              <w:rPr>
-                <w:b/>
-                <w:bCs/>
-                <w:sz w:val="19"/>
-                <w:szCs w:val="19"/>
-              </w:rPr>
-              <w:t>Introduttivo</w:t>
-            </w:r>
-            <w:proofErr w:type="spellEnd"/>
           </w:p>
         </w:tc>
         <w:tc>
@@ -795,28 +721,12 @@
             <w:vAlign w:val="center"/>
           </w:tcPr>
           <w:p>
-            <w:proofErr w:type="spellStart"/>
             <w:r>
               <w:rPr>
                 <w:sz w:val="18"/>
               </w:rPr>
-              <w:t>Visite</w:t>
+              <w:t>Visite completate</w:t>
             </w:r>
-            <w:proofErr w:type="spellEnd"/>
-            <w:r>
-              <w:rPr>
-                <w:sz w:val="18"/>
-              </w:rPr>
-              <w:t xml:space="preserve"> </w:t>
-            </w:r>
-            <w:proofErr w:type="spellStart"/>
-            <w:r>
-              <w:rPr>
-                <w:sz w:val="18"/>
-              </w:rPr>
-              <w:t>completate</w:t>
-            </w:r>
-            <w:proofErr w:type="spellEnd"/>
           </w:p>
         </w:tc>
         <w:tc>
@@ -866,28 +776,12 @@
             <w:vAlign w:val="center"/>
           </w:tcPr>
           <w:p>
-            <w:proofErr w:type="spellStart"/>
             <w:r>
               <w:rPr>
                 <w:sz w:val="18"/>
               </w:rPr>
-              <w:t>Fatturato</w:t>
+              <w:t>Fatturato incassato</w:t>
             </w:r>
-            <w:proofErr w:type="spellEnd"/>
-            <w:r>
-              <w:rPr>
-                <w:sz w:val="18"/>
-              </w:rPr>
-              <w:t xml:space="preserve"> </w:t>
-            </w:r>
-            <w:proofErr w:type="spellStart"/>
-            <w:r>
-              <w:rPr>
-                <w:sz w:val="18"/>
-              </w:rPr>
-              <w:t>incassato</w:t>
-            </w:r>
-            <w:proofErr w:type="spellEnd"/>
           </w:p>
         </w:tc>
         <w:tc>
@@ -2736,7 +2630,6 @@
             <w:vAlign w:val="center"/>
           </w:tcPr>
           <w:p>
-            <w:proofErr w:type="spellStart"/>
             <w:r>
               <w:rPr>
                 <w:sz w:val="18"/>
@@ -2744,7 +2637,6 @@
               <w:lastRenderedPageBreak/>
               <w:t>Segmentazione</w:t>
             </w:r>
-            <w:proofErr w:type="spellEnd"/>
           </w:p>
         </w:tc>
         <w:tc>
@@ -4461,6 +4353,7 @@
   <w:style w:type="character" w:default="1" w:styleId="Carpredefinitoparagrafo">
     <w:name w:val="Default Paragraph Font"/>
     <w:uiPriority w:val="1"/>
+    <w:semiHidden/>
     <w:unhideWhenUsed/>
   </w:style>
   <w:style w:type="table" w:default="1" w:styleId="Tabellanormale">
@@ -15237,6 +15130,29 @@
         <w:shd w:val="clear" w:color="auto" w:fill="FBCAA2" w:themeFill="accent6" w:themeFillTint="7F"/>
       </w:tcPr>
     </w:tblStylePr>
+  </w:style>
+  <w:style w:type="character" w:styleId="Collegamentoipertestuale">
+    <w:name w:val="Hyperlink"/>
+    <w:basedOn w:val="Carpredefinitoparagrafo"/>
+    <w:uiPriority w:val="99"/>
+    <w:unhideWhenUsed/>
+    <w:rsid w:val="00E24EF8"/>
+    <w:rPr>
+      <w:color w:val="0000FF" w:themeColor="hyperlink"/>
+      <w:u w:val="single"/>
+    </w:rPr>
+  </w:style>
+  <w:style w:type="character" w:styleId="Menzionenonrisolta">
+    <w:name w:val="Unresolved Mention"/>
+    <w:basedOn w:val="Carpredefinitoparagrafo"/>
+    <w:uiPriority w:val="99"/>
+    <w:semiHidden/>
+    <w:unhideWhenUsed/>
+    <w:rsid w:val="00E24EF8"/>
+    <w:rPr>
+      <w:color w:val="605E5C"/>
+      <w:shd w:val="clear" w:color="auto" w:fill="E1DFDD"/>
+    </w:rPr>
   </w:style>
 </w:styles>
 </file>

</xml_diff>